<commit_message>
add nghiep vu chinh/phu documents
</commit_message>
<xml_diff>
--- a/documents/1.docx
+++ b/documents/1.docx
@@ -634,15 +634,7 @@
       </w:r>
       <w:proofErr w:type="spellStart"/>
       <w:r>
-        <w:t>Đặt</w:t>
-      </w:r>
-      <w:proofErr w:type="spellEnd"/>
-      <w:r>
-        <w:t xml:space="preserve"> </w:t>
-      </w:r>
-      <w:proofErr w:type="spellStart"/>
-      <w:r>
-        <w:t>tên</w:t>
+        <w:t>Tên</w:t>
       </w:r>
       <w:proofErr w:type="spellEnd"/>
       <w:r>
@@ -654,22 +646,6 @@
       </w:r>
       <w:proofErr w:type="spellEnd"/>
       <w:r>
-        <w:t xml:space="preserve"> </w:t>
-      </w:r>
-      <w:proofErr w:type="spellStart"/>
-      <w:r>
-        <w:t>như</w:t>
-      </w:r>
-      <w:proofErr w:type="spellEnd"/>
-      <w:r>
-        <w:t xml:space="preserve"> </w:t>
-      </w:r>
-      <w:proofErr w:type="spellStart"/>
-      <w:r>
-        <w:t>sau</w:t>
-      </w:r>
-      <w:proofErr w:type="spellEnd"/>
-      <w:r>
         <w:t>: feature/</w:t>
       </w:r>
       <w:proofErr w:type="spellStart"/>
@@ -770,9 +746,35 @@
       <w:r>
         <w:t>nhá</w:t>
       </w:r>
-      <w:bookmarkStart w:id="0" w:name="_GoBack"/>
-      <w:bookmarkEnd w:id="0"/>
-      <w:proofErr w:type="spellEnd"/>
+      <w:proofErr w:type="spellEnd"/>
+    </w:p>
+    <w:p>
+      <w:r>
+        <w:tab/>
+        <w:t xml:space="preserve">Link: </w:t>
+      </w:r>
+      <w:hyperlink r:id="rId5" w:history="1">
+        <w:r>
+          <w:rPr>
+            <w:rStyle w:val="Hyperlink"/>
+          </w:rPr>
+          <w:t>toantran172005/Sport-E-Commerce-</w:t>
+        </w:r>
+        <w:bookmarkStart w:id="0" w:name="_GoBack"/>
+        <w:bookmarkEnd w:id="0"/>
+        <w:r>
+          <w:rPr>
+            <w:rStyle w:val="Hyperlink"/>
+          </w:rPr>
+          <w:t>P</w:t>
+        </w:r>
+        <w:r>
+          <w:rPr>
+            <w:rStyle w:val="Hyperlink"/>
+          </w:rPr>
+          <w:t>roject</w:t>
+        </w:r>
+      </w:hyperlink>
     </w:p>
     <w:sectPr>
       <w:pgSz w:w="11907" w:h="16840" w:code="9"/>
@@ -1398,6 +1400,18 @@
       <w:u w:val="single"/>
     </w:rPr>
   </w:style>
+  <w:style w:type="character" w:styleId="FollowedHyperlink">
+    <w:name w:val="FollowedHyperlink"/>
+    <w:basedOn w:val="DefaultParagraphFont"/>
+    <w:uiPriority w:val="99"/>
+    <w:semiHidden/>
+    <w:unhideWhenUsed/>
+    <w:rsid w:val="00BD7B90"/>
+    <w:rPr>
+      <w:color w:val="954F72" w:themeColor="followedHyperlink"/>
+      <w:u w:val="single"/>
+    </w:rPr>
+  </w:style>
 </w:styles>
 </file>
 
@@ -1701,7 +1715,7 @@
 </file>
 
 <file path=customXml/itemProps1.xml><?xml version="1.0" encoding="utf-8"?>
-<ds:datastoreItem xmlns:ds="http://schemas.openxmlformats.org/officeDocument/2006/customXml" ds:itemID="{9F4C07A9-215E-49D5-BD76-645FC630D42F}">
+<ds:datastoreItem xmlns:ds="http://schemas.openxmlformats.org/officeDocument/2006/customXml" ds:itemID="{F6143DAF-9948-4642-97C6-3CF0C80F92D7}">
   <ds:schemaRefs>
     <ds:schemaRef ds:uri="http://schemas.openxmlformats.org/officeDocument/2006/bibliography"/>
   </ds:schemaRefs>

</xml_diff>